<commit_message>
updated documentation and added example endpoints to server
</commit_message>
<xml_diff>
--- a/docs/source/simpleASSIGN/simpleASSIGN.docx
+++ b/docs/source/simpleASSIGN/simpleASSIGN.docx
@@ -43,7 +43,7 @@
       </w:r>
       <w:proofErr w:type="spellStart"/>
       <w:r>
-        <w:t>simplePREEDICT</w:t>
+        <w:t>simplePREDICT</w:t>
       </w:r>
       <w:proofErr w:type="spellEnd"/>
       <w:r>
@@ -89,19 +89,15 @@
       <w:r>
         <w:t xml:space="preserve">licked to export the </w:t>
       </w:r>
-      <w:proofErr w:type="spellStart"/>
-      <w:r>
-        <w:t>nmr</w:t>
-      </w:r>
-      <w:proofErr w:type="spellEnd"/>
+      <w:r>
+        <w:t>NMR</w:t>
+      </w:r>
       <w:r>
         <w:t xml:space="preserve"> data back into MNOVA via a </w:t>
       </w:r>
-      <w:proofErr w:type="spellStart"/>
-      <w:r>
-        <w:t>json</w:t>
-      </w:r>
-      <w:proofErr w:type="spellEnd"/>
+      <w:r>
+        <w:t>JSON</w:t>
+      </w:r>
       <w:r>
         <w:t xml:space="preserve"> file</w:t>
       </w:r>
@@ -141,28 +137,18 @@
       <w:r>
         <w:t xml:space="preserve"> in </w:t>
       </w:r>
-      <w:proofErr w:type="gramStart"/>
-      <w:r>
-        <w:t>MNOVA</w:t>
-      </w:r>
-      <w:r>
-        <w:t xml:space="preserve"> </w:t>
-      </w:r>
-      <w:r>
-        <w:t xml:space="preserve"> will</w:t>
-      </w:r>
-      <w:proofErr w:type="gramEnd"/>
+      <w:r>
+        <w:t>MNOVA will</w:t>
+      </w:r>
       <w:r>
         <w:t xml:space="preserve"> go from red to green and the </w:t>
       </w:r>
       <w:r>
         <w:t xml:space="preserve">html </w:t>
       </w:r>
-      <w:proofErr w:type="spellStart"/>
-      <w:r>
-        <w:t>gui</w:t>
-      </w:r>
-      <w:proofErr w:type="spellEnd"/>
+      <w:r>
+        <w:t>GUI</w:t>
+      </w:r>
       <w:r>
         <w:t xml:space="preserve"> page will be </w:t>
       </w:r>

</xml_diff>